<commit_message>
Aktualizacja raportu 1: wyjasnienie osi czasu (brak timestampow) i uzasadnienie OULAD
</commit_message>
<xml_diff>
--- a/RAPORTY/Raport_2_wersja_do_prezentacji-2.docx
+++ b/RAPORTY/Raport_2_wersja_do_prezentacji-2.docx
@@ -2697,6 +2697,63 @@
     </w:p>
     <w:p>
       <w:pPr>
+        <w:spacing w:before="120" w:after="40"/>
+      </w:pPr>
+      <w:r>
+        <w:rPr>
+          <w:b/>
+          <w:color w:val="1B365D"/>
+        </w:rPr>
+        <w:t>Dlaczego brak dokładnych godzin (timestampów hh:mm:ss) i dlaczego zbiór jest optymalny?</w:t>
+      </w:r>
+    </w:p>
+    <w:p>
+      <w:pPr>
+        <w:pStyle w:val="ListParagraph"/>
+        <w:spacing w:after="40"/>
+      </w:pPr>
+      <w:r>
+        <w:rPr>
+          <w:b/>
+        </w:rPr>
+        <w:t xml:space="preserve">Anonimizacja i redukcja szumu: </w:t>
+      </w:r>
+      <w:r>
+        <w:t>Open University usunął znaczniki godzinowe ze względów ochrony prywatności (RODO). Pojedyncze kliknięcia w obrębie minuty wprowadzają szum stochastyczny bez wartości dydaktycznej.</w:t>
+      </w:r>
+    </w:p>
+    <w:p>
+      <w:pPr>
+        <w:pStyle w:val="ListParagraph"/>
+        <w:spacing w:after="40"/>
+      </w:pPr>
+      <w:r>
+        <w:rPr>
+          <w:b/>
+        </w:rPr>
+        <w:t xml:space="preserve">Idealna długość sekwencji dla LSTM: </w:t>
+      </w:r>
+      <w:r>
+        <w:t>Gdyby rejestrować sekundy, sekwencja miałaby &gt;50 000 kroków, powodując eksplozję pamięci i zanikanie gradientu. Krok dzienny (okno 14–28 kroków) to matematycznie idealny horyzont pamięci sieci rekurencyjnej.</w:t>
+      </w:r>
+    </w:p>
+    <w:p>
+      <w:pPr>
+        <w:pStyle w:val="ListParagraph"/>
+        <w:spacing w:after="40"/>
+      </w:pPr>
+      <w:r>
+        <w:rPr>
+          <w:b/>
+        </w:rPr>
+        <w:t xml:space="preserve">Złoty standard w nauce: </w:t>
+      </w:r>
+      <w:r>
+        <w:t>OULAD (Nature Scientific Data 2017) to najpopularniejszy na świecie benchmark w Educational Data Mining – dziesiątki publikacji IEEE/ACM modelują dokładnie te dzienne sekwencje.</w:t>
+      </w:r>
+    </w:p>
+    <w:p>
+      <w:pPr>
         <w:spacing w:after="100"/>
         <w:rPr>
           <w:lang w:val="pl-PL"/>
@@ -5696,6 +5753,7 @@
       <w:tblGrid>
         <w:gridCol w:w="6000"/>
         <w:gridCol w:w="8570"/>
+        <w:gridCol w:w="4608"/>
       </w:tblGrid>
       <w:tr>
         <w:tblPrEx>
@@ -5771,6 +5829,19 @@
             </w:r>
           </w:p>
         </w:tc>
+        <w:tc>
+          <w:tcPr>
+            <w:tcW w:type="dxa" w:w="4608"/>
+          </w:tcPr>
+          <w:p>
+            <w:r>
+              <w:rPr>
+                <w:b/>
+              </w:rPr>
+              <w:t>Zakres zadań</w:t>
+            </w:r>
+          </w:p>
+        </w:tc>
       </w:tr>
       <w:tr>
         <w:tblPrEx>
@@ -5852,6 +5923,16 @@
             <w:proofErr w:type="spellEnd"/>
           </w:p>
         </w:tc>
+        <w:tc>
+          <w:tcPr>
+            <w:tcW w:type="dxa" w:w="4608"/>
+          </w:tcPr>
+          <w:p>
+            <w:r>
+              <w:t>Dokumentacja, formalna struktura raportów tygodniowych, systematyzacja wniosków.</w:t>
+            </w:r>
+          </w:p>
+        </w:tc>
       </w:tr>
       <w:tr>
         <w:tblPrEx>
@@ -5924,6 +6005,16 @@
             </w:r>
           </w:p>
         </w:tc>
+        <w:tc>
+          <w:tcPr>
+            <w:tcW w:type="dxa" w:w="4608"/>
+          </w:tcPr>
+          <w:p>
+            <w:r>
+              <w:t>Eksploracja danych (EDA), testy statystyczne (H1), analiza kryzysu motywacyjnego (H3).</w:t>
+            </w:r>
+          </w:p>
+        </w:tc>
       </w:tr>
       <w:tr>
         <w:tblPrEx>
@@ -5991,6 +6082,16 @@
                 <w:szCs w:val="26"/>
               </w:rPr>
               <w:t>Weronika Bieńkowska</w:t>
+            </w:r>
+          </w:p>
+        </w:tc>
+        <w:tc>
+          <w:tcPr>
+            <w:tcW w:type="dxa" w:w="4608"/>
+          </w:tcPr>
+          <w:p>
+            <w:r>
+              <w:t>Architektura i trening sieci LSTM (PyTorch) oraz XGBoost (H2), przygotowanie Sliding Window, GitHub.</w:t>
             </w:r>
           </w:p>
         </w:tc>

</xml_diff>